<commit_message>
Corrige acentuacao no Word processo_notificacoes_email_glpi
</commit_message>
<xml_diff>
--- a/documentações/Processos/docx/processo_notificacoes_email_glpi.docx
+++ b/documentações/Processos/docx/processo_notificacoes_email_glpi.docx
@@ -41,7 +41,7 @@
           <w:color w:val="5E6B78"/>
           <w:sz w:val="19"/>
         </w:rPr>
-        <w:t>Ãrea responsÃ¡vel e versÃ£o conforme documentaÃ§Ã£o institucional</w:t>
+        <w:t>Área responsável e versão conforme documentação institucional</w:t>
       </w:r>
     </w:p>
     <w:p>
@@ -498,40 +498,7 @@
         <w:keepNext/>
         <w:jc w:val="center"/>
       </w:pPr>
-      <w:r>
-        <w:drawing>
-          <wp:inline xmlns:a="http://schemas.openxmlformats.org/drawingml/2006/main" xmlns:pic="http://schemas.openxmlformats.org/drawingml/2006/picture">
-            <wp:extent cx="3956304" cy="1993392"/>
-            <wp:docPr id="1" name="Picture 1"/>
-            <wp:cNvGraphicFramePr>
-              <a:graphicFrameLocks noChangeAspect="1"/>
-            </wp:cNvGraphicFramePr>
-            <a:graphic>
-              <a:graphicData uri="http://schemas.openxmlformats.org/drawingml/2006/picture">
-                <pic:pic>
-                  <pic:nvPicPr>
-                    <pic:cNvPr id="0" name="processo_notificacoes_email_glpi_1.png"/>
-                    <pic:cNvPicPr/>
-                  </pic:nvPicPr>
-                  <pic:blipFill>
-                    <a:blip r:embed="rId11"/>
-                    <a:stretch>
-                      <a:fillRect/>
-                    </a:stretch>
-                  </pic:blipFill>
-                  <pic:spPr>
-                    <a:xfrm>
-                      <a:off x="0" y="0"/>
-                      <a:ext cx="3956304" cy="1993392"/>
-                    </a:xfrm>
-                    <a:prstGeom prst="rect"/>
-                  </pic:spPr>
-                </pic:pic>
-              </a:graphicData>
-            </a:graphic>
-          </wp:inline>
-        </w:drawing>
-      </w:r>
+      <w:r/>
     </w:p>
     <w:p>
       <w:pPr>
@@ -708,40 +675,7 @@
         <w:keepNext/>
         <w:jc w:val="center"/>
       </w:pPr>
-      <w:r>
-        <w:drawing>
-          <wp:inline xmlns:a="http://schemas.openxmlformats.org/drawingml/2006/main" xmlns:pic="http://schemas.openxmlformats.org/drawingml/2006/picture">
-            <wp:extent cx="5623560" cy="3320183"/>
-            <wp:docPr id="2" name="Picture 2"/>
-            <wp:cNvGraphicFramePr>
-              <a:graphicFrameLocks noChangeAspect="1"/>
-            </wp:cNvGraphicFramePr>
-            <a:graphic>
-              <a:graphicData uri="http://schemas.openxmlformats.org/drawingml/2006/picture">
-                <pic:pic>
-                  <pic:nvPicPr>
-                    <pic:cNvPr id="0" name="processo_notificacoes_email_glpi_2.png"/>
-                    <pic:cNvPicPr/>
-                  </pic:nvPicPr>
-                  <pic:blipFill>
-                    <a:blip r:embed="rId12"/>
-                    <a:stretch>
-                      <a:fillRect/>
-                    </a:stretch>
-                  </pic:blipFill>
-                  <pic:spPr>
-                    <a:xfrm>
-                      <a:off x="0" y="0"/>
-                      <a:ext cx="5623560" cy="3320183"/>
-                    </a:xfrm>
-                    <a:prstGeom prst="rect"/>
-                  </pic:spPr>
-                </pic:pic>
-              </a:graphicData>
-            </a:graphic>
-          </wp:inline>
-        </w:drawing>
-      </w:r>
+      <w:r/>
     </w:p>
     <w:p>
       <w:pPr>
@@ -821,6 +755,8 @@
     <w:sectPr>
       <w:headerReference w:type="default" r:id="rId9"/>
       <w:footerReference w:type="default" r:id="rId10"/>
+      <w:headerReference w:type="first" r:id="rId13"/>
+      <w:footerReference w:type="first" r:id="rId14"/>
       <w:pgSz w:w="12240" w:h="15840"/>
       <w:pgMar w:top="1080" w:right="1123" w:bottom="1080" w:left="1123" w:header="504" w:footer="504" w:gutter="0"/>
       <w:cols w:space="720"/>
@@ -843,7 +779,7 @@
         <w:color w:val="5E6B78"/>
         <w:sz w:val="17"/>
       </w:rPr>
-      <w:t xml:space="preserve">Secretaria de SaÃºde do Recife  |  </w:t>
+      <w:t xml:space="preserve">Secretaria de Saúde do Recife  |  </w:t>
     </w:r>
     <w:r>
       <w:rPr>
@@ -851,9 +787,19 @@
         <w:color w:val="5E6B78"/>
         <w:sz w:val="18"/>
       </w:rPr>
-      <w:t xml:space="preserve">PÃ¡gina </w:t>
+      <w:t xml:space="preserve">Página </w:t>
     </w:r>
     <w:fldSimple w:instr="PAGE"/>
+  </w:p>
+</w:ftr>
+</file>
+
+<file path=word/footer2.xml><?xml version="1.0" encoding="utf-8"?>
+<w:ftr xmlns:m="http://schemas.openxmlformats.org/officeDocument/2006/math" xmlns:mc="http://schemas.openxmlformats.org/markup-compatibility/2006" xmlns:mo="http://schemas.microsoft.com/office/mac/office/2008/main" xmlns:mv="urn:schemas-microsoft-com:mac:vml" xmlns:o="urn:schemas-microsoft-com:office:office" xmlns:r="http://schemas.openxmlformats.org/officeDocument/2006/relationships" xmlns:v="urn:schemas-microsoft-com:vml" xmlns:w10="urn:schemas-microsoft-com:office:word" xmlns:w14="http://schemas.microsoft.com/office/word/2010/wordml" xmlns:w="http://schemas.openxmlformats.org/wordprocessingml/2006/main" xmlns:wne="http://schemas.microsoft.com/office/word/2006/wordml" xmlns:wp14="http://schemas.microsoft.com/office/word/2010/wordprocessingDrawing" xmlns:wp="http://schemas.openxmlformats.org/drawingml/2006/wordprocessingDrawing" xmlns:wpc="http://schemas.microsoft.com/office/word/2010/wordprocessingCanvas" xmlns:wpg="http://schemas.microsoft.com/office/word/2010/wordprocessingGroup" xmlns:wpi="http://schemas.microsoft.com/office/word/2010/wordprocessingInk" xmlns:wps="http://schemas.microsoft.com/office/word/2010/wordprocessingShape" mc:Ignorable="w14 wp14">
+  <w:p>
+    <w:pPr>
+      <w:pStyle w:val="Footer"/>
+    </w:pPr>
   </w:p>
 </w:ftr>
 </file>
@@ -872,8 +818,18 @@
         <w:color w:val="5E6B78"/>
         <w:sz w:val="17"/>
       </w:rPr>
-      <w:t>SAÃšDE DIGITAL ATENDE  |  PROCESSO OPERACIONAL</w:t>
+      <w:t>SAÚDE DIGITAL ATENDE  |  PROCESSO OPERACIONAL</w:t>
     </w:r>
+  </w:p>
+</w:hdr>
+</file>
+
+<file path=word/header2.xml><?xml version="1.0" encoding="utf-8"?>
+<w:hdr xmlns:m="http://schemas.openxmlformats.org/officeDocument/2006/math" xmlns:mc="http://schemas.openxmlformats.org/markup-compatibility/2006" xmlns:mo="http://schemas.microsoft.com/office/mac/office/2008/main" xmlns:mv="urn:schemas-microsoft-com:mac:vml" xmlns:o="urn:schemas-microsoft-com:office:office" xmlns:r="http://schemas.openxmlformats.org/officeDocument/2006/relationships" xmlns:v="urn:schemas-microsoft-com:vml" xmlns:w10="urn:schemas-microsoft-com:office:word" xmlns:w14="http://schemas.microsoft.com/office/word/2010/wordml" xmlns:w="http://schemas.openxmlformats.org/wordprocessingml/2006/main" xmlns:wne="http://schemas.microsoft.com/office/word/2006/wordml" xmlns:wp14="http://schemas.microsoft.com/office/word/2010/wordprocessingDrawing" xmlns:wp="http://schemas.openxmlformats.org/drawingml/2006/wordprocessingDrawing" xmlns:wpc="http://schemas.microsoft.com/office/word/2010/wordprocessingCanvas" xmlns:wpg="http://schemas.microsoft.com/office/word/2010/wordprocessingGroup" xmlns:wpi="http://schemas.microsoft.com/office/word/2010/wordprocessingInk" xmlns:wps="http://schemas.microsoft.com/office/word/2010/wordprocessingShape" mc:Ignorable="w14 wp14">
+  <w:p>
+    <w:pPr>
+      <w:pStyle w:val="Header"/>
+    </w:pPr>
   </w:p>
 </w:hdr>
 </file>

</xml_diff>

<commit_message>
Atualiza Word padronizado processo_notificacoes_email_glpi
</commit_message>
<xml_diff>
--- a/documentações/Processos/docx/processo_notificacoes_email_glpi.docx
+++ b/documentações/Processos/docx/processo_notificacoes_email_glpi.docx
@@ -49,7 +49,754 @@
         <w:pStyle w:val="Heading1"/>
       </w:pPr>
       <w:r>
-        <w:t>01 Histórico de Revisões</w:t>
+        <w:t>Identificação</w:t>
+      </w:r>
+    </w:p>
+    <w:tbl>
+      <w:tblPr>
+        <w:tblStyle w:val="TableGrid"/>
+        <w:tblW w:type="auto" w:w="0"/>
+        <w:jc w:val="center"/>
+        <w:tblLayout w:type="fixed"/>
+        <w:tblLook w:firstColumn="1" w:firstRow="1" w:lastColumn="0" w:lastRow="0" w:noHBand="0" w:noVBand="1" w:val="04A0"/>
+      </w:tblPr>
+      <w:tblGrid>
+        <w:gridCol w:w="2600"/>
+        <w:gridCol w:w="6760"/>
+      </w:tblGrid>
+      <w:tr>
+        <w:tc>
+          <w:tcPr>
+            <w:tcW w:type="dxa" w:w="2600"/>
+            <w:tcMar>
+              <w:top w:w="90" w:type="dxa"/>
+              <w:start w:w="120" w:type="dxa"/>
+              <w:bottom w:w="90" w:type="dxa"/>
+              <w:end w:w="120" w:type="dxa"/>
+            </w:tcMar>
+            <w:vAlign w:val="center"/>
+          </w:tcPr>
+          <w:p>
+            <w:pPr>
+              <w:spacing w:after="0"/>
+            </w:pPr>
+            <w:r>
+              <w:rPr>
+                <w:rFonts w:ascii="Arial" w:hAnsi="Arial"/>
+                <w:sz w:val="18"/>
+              </w:rPr>
+              <w:t>Tipo</w:t>
+            </w:r>
+          </w:p>
+        </w:tc>
+        <w:tc>
+          <w:tcPr>
+            <w:tcW w:type="dxa" w:w="6760"/>
+            <w:tcMar>
+              <w:top w:w="90" w:type="dxa"/>
+              <w:start w:w="120" w:type="dxa"/>
+              <w:bottom w:w="90" w:type="dxa"/>
+              <w:end w:w="120" w:type="dxa"/>
+            </w:tcMar>
+            <w:vAlign w:val="center"/>
+          </w:tcPr>
+          <w:p>
+            <w:pPr>
+              <w:spacing w:after="0"/>
+            </w:pPr>
+            <w:r>
+              <w:rPr>
+                <w:rFonts w:ascii="Arial" w:hAnsi="Arial"/>
+                <w:sz w:val="18"/>
+              </w:rPr>
+              <w:t>Processo Operacional</w:t>
+            </w:r>
+          </w:p>
+        </w:tc>
+      </w:tr>
+      <w:tr>
+        <w:tc>
+          <w:tcPr>
+            <w:tcW w:type="dxa" w:w="2600"/>
+            <w:tcMar>
+              <w:top w:w="90" w:type="dxa"/>
+              <w:start w:w="120" w:type="dxa"/>
+              <w:bottom w:w="90" w:type="dxa"/>
+              <w:end w:w="120" w:type="dxa"/>
+            </w:tcMar>
+            <w:vAlign w:val="center"/>
+          </w:tcPr>
+          <w:p>
+            <w:pPr>
+              <w:spacing w:after="0"/>
+            </w:pPr>
+            <w:r>
+              <w:rPr>
+                <w:rFonts w:ascii="Arial" w:hAnsi="Arial"/>
+                <w:sz w:val="18"/>
+              </w:rPr>
+              <w:t>Título</w:t>
+            </w:r>
+          </w:p>
+        </w:tc>
+        <w:tc>
+          <w:tcPr>
+            <w:tcW w:type="dxa" w:w="6760"/>
+            <w:tcMar>
+              <w:top w:w="90" w:type="dxa"/>
+              <w:start w:w="120" w:type="dxa"/>
+              <w:bottom w:w="90" w:type="dxa"/>
+              <w:end w:w="120" w:type="dxa"/>
+            </w:tcMar>
+            <w:vAlign w:val="center"/>
+          </w:tcPr>
+          <w:p>
+            <w:pPr>
+              <w:spacing w:after="0"/>
+            </w:pPr>
+            <w:r>
+              <w:rPr>
+                <w:rFonts w:ascii="Arial" w:hAnsi="Arial"/>
+                <w:sz w:val="18"/>
+              </w:rPr>
+              <w:t>Processo Operacional – Notificações de e-mail de Abertura e Encerramento de Chamados no GLPI</w:t>
+            </w:r>
+          </w:p>
+        </w:tc>
+      </w:tr>
+      <w:tr>
+        <w:tc>
+          <w:tcPr>
+            <w:tcW w:type="dxa" w:w="2600"/>
+            <w:tcMar>
+              <w:top w:w="90" w:type="dxa"/>
+              <w:start w:w="120" w:type="dxa"/>
+              <w:bottom w:w="90" w:type="dxa"/>
+              <w:end w:w="120" w:type="dxa"/>
+            </w:tcMar>
+            <w:vAlign w:val="center"/>
+          </w:tcPr>
+          <w:p>
+            <w:pPr>
+              <w:spacing w:after="0"/>
+            </w:pPr>
+            <w:r>
+              <w:rPr>
+                <w:rFonts w:ascii="Arial" w:hAnsi="Arial"/>
+                <w:sz w:val="18"/>
+              </w:rPr>
+              <w:t>Área responsável</w:t>
+            </w:r>
+          </w:p>
+        </w:tc>
+        <w:tc>
+          <w:tcPr>
+            <w:tcW w:type="dxa" w:w="6760"/>
+            <w:tcMar>
+              <w:top w:w="90" w:type="dxa"/>
+              <w:start w:w="120" w:type="dxa"/>
+              <w:bottom w:w="90" w:type="dxa"/>
+              <w:end w:w="120" w:type="dxa"/>
+            </w:tcMar>
+            <w:vAlign w:val="center"/>
+          </w:tcPr>
+          <w:p>
+            <w:pPr>
+              <w:spacing w:after="0"/>
+            </w:pPr>
+            <w:r>
+              <w:rPr>
+                <w:rFonts w:ascii="Arial" w:hAnsi="Arial"/>
+                <w:sz w:val="18"/>
+              </w:rPr>
+              <w:t>Sistemas</w:t>
+            </w:r>
+          </w:p>
+        </w:tc>
+      </w:tr>
+      <w:tr>
+        <w:tc>
+          <w:tcPr>
+            <w:tcW w:type="dxa" w:w="2600"/>
+            <w:tcMar>
+              <w:top w:w="90" w:type="dxa"/>
+              <w:start w:w="120" w:type="dxa"/>
+              <w:bottom w:w="90" w:type="dxa"/>
+              <w:end w:w="120" w:type="dxa"/>
+            </w:tcMar>
+            <w:vAlign w:val="center"/>
+          </w:tcPr>
+          <w:p>
+            <w:pPr>
+              <w:spacing w:after="0"/>
+            </w:pPr>
+            <w:r>
+              <w:rPr>
+                <w:rFonts w:ascii="Arial" w:hAnsi="Arial"/>
+                <w:sz w:val="18"/>
+              </w:rPr>
+              <w:t>Versão</w:t>
+            </w:r>
+          </w:p>
+        </w:tc>
+        <w:tc>
+          <w:tcPr>
+            <w:tcW w:type="dxa" w:w="6760"/>
+            <w:tcMar>
+              <w:top w:w="90" w:type="dxa"/>
+              <w:start w:w="120" w:type="dxa"/>
+              <w:bottom w:w="90" w:type="dxa"/>
+              <w:end w:w="120" w:type="dxa"/>
+            </w:tcMar>
+            <w:vAlign w:val="center"/>
+          </w:tcPr>
+          <w:p>
+            <w:pPr>
+              <w:spacing w:after="0"/>
+            </w:pPr>
+            <w:r>
+              <w:rPr>
+                <w:rFonts w:ascii="Arial" w:hAnsi="Arial"/>
+                <w:sz w:val="18"/>
+              </w:rPr>
+              <w:t>2026</w:t>
+            </w:r>
+          </w:p>
+        </w:tc>
+      </w:tr>
+    </w:tbl>
+    <w:p>
+      <w:pPr>
+        <w:spacing w:after="40"/>
+      </w:pPr>
+    </w:p>
+    <w:p>
+      <w:pPr>
+        <w:pStyle w:val="Heading1"/>
+      </w:pPr>
+      <w:r>
+        <w:t>Objetivo</w:t>
+      </w:r>
+    </w:p>
+    <w:p>
+      <w:r>
+        <w:t xml:space="preserve">Este Processo Operacional estabelece como os chamados devem ser abertos e encerrados no </w:t>
+      </w:r>
+      <w:r>
+        <w:rPr>
+          <w:b/>
+        </w:rPr>
+        <w:t>GLPI</w:t>
+      </w:r>
+      <w:r>
+        <w:t xml:space="preserve"> para que as notificações automáticas por e-mail sejam enviadas corretamente ao usuário final, garantindo padronização, rastreabilidade, transparência e melhoria contínua dos atendimentos.</w:t>
+      </w:r>
+    </w:p>
+    <w:p>
+      <w:pPr>
+        <w:pStyle w:val="Heading2"/>
+      </w:pPr>
+      <w:r>
+        <w:t>03 Visão Geral das Notificações Automáticas</w:t>
+      </w:r>
+    </w:p>
+    <w:p>
+      <w:r>
+        <w:t xml:space="preserve">Os usuários receberão automaticamente notificação de e-mail para abertura e encerramento de chamado durante o ciclo de vida do chamado, conforme os dados registrados no </w:t>
+      </w:r>
+      <w:r>
+        <w:rPr>
+          <w:b/>
+        </w:rPr>
+        <w:t>GLPI</w:t>
+      </w:r>
+      <w:r>
+        <w:t xml:space="preserve"> e os modelos padronizados implementados através da integração com o </w:t>
+      </w:r>
+      <w:r>
+        <w:rPr>
+          <w:b/>
+        </w:rPr>
+        <w:t>n8n</w:t>
+      </w:r>
+      <w:r>
+        <w:t>.</w:t>
+      </w:r>
+    </w:p>
+    <w:p>
+      <w:r>
+        <w:t xml:space="preserve">As notificações serão enviadas automaticamente a cada </w:t>
+      </w:r>
+      <w:r>
+        <w:rPr>
+          <w:b/>
+        </w:rPr>
+        <w:t>5 minutos</w:t>
+      </w:r>
+      <w:r>
+        <w:t xml:space="preserve"> e contemplarão dois processos principais:</w:t>
+      </w:r>
+    </w:p>
+    <w:p>
+      <w:pPr>
+        <w:pStyle w:val="ListBullet"/>
+        <w:spacing w:after="80"/>
+      </w:pPr>
+      <w:r>
+        <w:t>✅ Confirmação de abertura do chamado</w:t>
+      </w:r>
+    </w:p>
+    <w:p>
+      <w:pPr>
+        <w:pStyle w:val="ListBullet"/>
+        <w:spacing w:after="80"/>
+      </w:pPr>
+      <w:r>
+        <w:t>🔗 Informações para acompanhamento do ticket</w:t>
+      </w:r>
+    </w:p>
+    <w:p>
+      <w:pPr>
+        <w:pStyle w:val="ListBullet"/>
+        <w:spacing w:after="80"/>
+      </w:pPr>
+      <w:r>
+        <w:t>🔒 Notificação de encerramento do chamado</w:t>
+      </w:r>
+    </w:p>
+    <w:p>
+      <w:pPr>
+        <w:pStyle w:val="ListBullet"/>
+        <w:spacing w:after="80"/>
+      </w:pPr>
+      <w:r>
+        <w:t>⭐ Envio de pesquisa de satisfação ao usuário</w:t>
+      </w:r>
+    </w:p>
+    <w:p>
+      <w:pPr>
+        <w:pStyle w:val="Heading1"/>
+      </w:pPr>
+      <w:r>
+        <w:t>Fluxo resumido</w:t>
+      </w:r>
+    </w:p>
+    <w:p>
+      <w:pPr>
+        <w:spacing w:after="80"/>
+      </w:pPr>
+      <w:r>
+        <w:t>1. Abrir O chamado é registrado no GLPI com o e-mail correto do usuário.</w:t>
+      </w:r>
+    </w:p>
+    <w:p>
+      <w:pPr>
+        <w:spacing w:after="80"/>
+      </w:pPr>
+      <w:r>
+        <w:t>2. Processar A automação consulta os eventos do GLPI e prepara a comunicação padronizada.</w:t>
+      </w:r>
+    </w:p>
+    <w:p>
+      <w:pPr>
+        <w:spacing w:after="80"/>
+      </w:pPr>
+      <w:r>
+        <w:t>3. Notificar O usuário recebe por e-mail o protocolo e as atualizações previstas no processo.</w:t>
+      </w:r>
+    </w:p>
+    <w:p>
+      <w:pPr>
+        <w:spacing w:after="80"/>
+      </w:pPr>
+      <w:r>
+        <w:t>4. Concluir Na solução ou no fechamento, é enviada a confirmação com o link da pesquisa de satisfação.</w:t>
+      </w:r>
+    </w:p>
+    <w:p>
+      <w:pPr>
+        <w:pStyle w:val="Heading1"/>
+      </w:pPr>
+      <w:r>
+        <w:t>Processo 1 - Abertura do Chamado</w:t>
+      </w:r>
+    </w:p>
+    <w:p>
+      <w:r>
+        <w:t>A abertura do chamado deve ser realizada com preenchimento completo dos campos necessários para que o GLPI registre corretamente a solicitação e envie a confirmação de abertura ao usuário final.</w:t>
+      </w:r>
+    </w:p>
+    <w:p>
+      <w:pPr>
+        <w:pStyle w:val="ListBullet"/>
+        <w:spacing w:after="80"/>
+      </w:pPr>
+      <w:r>
+        <w:t>01 Acessar o GLPI e iniciar a criação do chamado.</w:t>
+      </w:r>
+    </w:p>
+    <w:p>
+      <w:pPr>
+        <w:pStyle w:val="ListBullet"/>
+        <w:spacing w:after="80"/>
+      </w:pPr>
+      <w:r>
+        <w:t>02 Preencher os dados do usuário final, incluindo nome, unidade, setor e demais informações de identificação.</w:t>
+      </w:r>
+    </w:p>
+    <w:p>
+      <w:pPr>
+        <w:pStyle w:val="ListBullet"/>
+        <w:spacing w:after="80"/>
+      </w:pPr>
+      <w:r>
+        <w:t>03 Preencher obrigatoriamente o campo de e-mail do usuário final, pois é esse campo que permite o envio da confirmação automática de abertura.</w:t>
+      </w:r>
+    </w:p>
+    <w:p>
+      <w:pPr>
+        <w:pStyle w:val="ListBullet"/>
+        <w:spacing w:after="80"/>
+      </w:pPr>
+      <w:r>
+        <w:t>04 Categorizar o chamado conforme o catálogo de serviços, selecionando categoria, tipo, urgência e grupo técnico responsável quando aplicável.</w:t>
+      </w:r>
+    </w:p>
+    <w:p>
+      <w:pPr>
+        <w:pStyle w:val="ListBullet"/>
+        <w:spacing w:after="80"/>
+      </w:pPr>
+      <w:r>
+        <w:t>05 Preencher título e descrição de forma clara, objetiva e suficiente para entendimento da demanda.</w:t>
+      </w:r>
+    </w:p>
+    <w:p>
+      <w:pPr>
+        <w:pStyle w:val="ListBullet"/>
+        <w:spacing w:after="80"/>
+      </w:pPr>
+      <w:r>
+        <w:t>06 Salvar o chamado no GLPI e conferir se os dados essenciais foram registrados corretamente.</w:t>
+      </w:r>
+    </w:p>
+    <w:p>
+      <w:pPr>
+        <w:spacing w:after="80"/>
+      </w:pPr>
+      <w:r>
+        <w:rPr>
+          <w:color w:val="163A63"/>
+        </w:rPr>
+        <w:t>📧 E-mail obrigatório: sem o e-mail do usuário final, a confirmação automática de abertura não será enviada corretamente.</w:t>
+      </w:r>
+    </w:p>
+    <w:p>
+      <w:r>
+        <w:t>Após o registro do chamado no GLPI, o usuário receberá automaticamente um e-mail contendo:</w:t>
+      </w:r>
+    </w:p>
+    <w:p>
+      <w:pPr>
+        <w:pStyle w:val="ListBullet"/>
+        <w:spacing w:after="80"/>
+      </w:pPr>
+      <w:r>
+        <w:t>🎫 Número do ticket</w:t>
+      </w:r>
+    </w:p>
+    <w:p>
+      <w:pPr>
+        <w:pStyle w:val="ListBullet"/>
+        <w:spacing w:after="80"/>
+      </w:pPr>
+      <w:r>
+        <w:t>👤 Nome do usuário</w:t>
+      </w:r>
+    </w:p>
+    <w:p>
+      <w:pPr>
+        <w:pStyle w:val="ListBullet"/>
+        <w:spacing w:after="80"/>
+      </w:pPr>
+      <w:r>
+        <w:t>📅 Data de abertura</w:t>
+      </w:r>
+    </w:p>
+    <w:p>
+      <w:pPr>
+        <w:pStyle w:val="ListBullet"/>
+        <w:spacing w:after="80"/>
+      </w:pPr>
+      <w:r>
+        <w:t>🔍 Informações para acompanhamento do chamado</w:t>
+      </w:r>
+    </w:p>
+    <w:p>
+      <w:pPr>
+        <w:keepNext/>
+        <w:jc w:val="center"/>
+      </w:pPr>
+      <w:r/>
+    </w:p>
+    <w:p>
+      <w:pPr>
+        <w:spacing w:after="160"/>
+        <w:jc w:val="center"/>
+      </w:pPr>
+      <w:r>
+        <w:rPr>
+          <w:rFonts w:ascii="Arial" w:hAnsi="Arial"/>
+          <w:i/>
+          <w:color w:val="5E6B78"/>
+          <w:sz w:val="17"/>
+        </w:rPr>
+        <w:t>Modelo de e-mail de confirmação de abertura de chamado</w:t>
+      </w:r>
+    </w:p>
+    <w:p>
+      <w:pPr>
+        <w:spacing w:after="80"/>
+      </w:pPr>
+      <w:r>
+        <w:rPr>
+          <w:color w:val="163A63"/>
+        </w:rPr>
+        <w:t>⚠️ Atenção: Para que os usuários recebam corretamente as notificações automáticas, o campo de e-mail e nome deverão ser obrigatoriamente preenchidos na abertura do chamado.</w:t>
+      </w:r>
+    </w:p>
+    <w:p>
+      <w:pPr>
+        <w:pStyle w:val="Heading1"/>
+      </w:pPr>
+      <w:r>
+        <w:t>Processo 2 - Encerramento do Chamado</w:t>
+      </w:r>
+    </w:p>
+    <w:p>
+      <w:r>
+        <w:t xml:space="preserve">O encerramento do chamado deve ser realizado somente após o atendimento ser concluído e a solução estar registrada no GLPI. Ao alterar o status para </w:t>
+      </w:r>
+      <w:r>
+        <w:rPr>
+          <w:b/>
+        </w:rPr>
+        <w:t>SOLUCIONADO</w:t>
+      </w:r>
+      <w:r>
+        <w:t xml:space="preserve"> ou </w:t>
+      </w:r>
+      <w:r>
+        <w:rPr>
+          <w:b/>
+        </w:rPr>
+        <w:t>FECHADO</w:t>
+      </w:r>
+      <w:r>
+        <w:t>, o usuário final receberá a notificação automática de encerramento e o link da pesquisa de satisfação.</w:t>
+      </w:r>
+    </w:p>
+    <w:p>
+      <w:pPr>
+        <w:pStyle w:val="ListBullet"/>
+        <w:spacing w:after="80"/>
+      </w:pPr>
+      <w:r>
+        <w:t>01 Confirmar que o atendimento foi concluído e que não há pendência técnica ou administrativa no chamado.</w:t>
+      </w:r>
+    </w:p>
+    <w:p>
+      <w:pPr>
+        <w:pStyle w:val="ListBullet"/>
+        <w:spacing w:after="80"/>
+      </w:pPr>
+      <w:r>
+        <w:t>02 Registrar a solução no chamado, descrevendo de forma objetiva o que foi realizado e o resultado do atendimento.</w:t>
+      </w:r>
+    </w:p>
+    <w:p>
+      <w:pPr>
+        <w:pStyle w:val="ListBullet"/>
+        <w:spacing w:after="80"/>
+      </w:pPr>
+      <w:r>
+        <w:t>03 Alterar o status do chamado para SOLUCIONADO ou FECHADO .</w:t>
+      </w:r>
+    </w:p>
+    <w:p>
+      <w:pPr>
+        <w:pStyle w:val="ListBullet"/>
+        <w:spacing w:after="80"/>
+      </w:pPr>
+      <w:r>
+        <w:t>04 Após a alteração do status, o GLPI/n8n enviará automaticamente ao usuário final o e-mail de encerramento.</w:t>
+      </w:r>
+    </w:p>
+    <w:p>
+      <w:pPr>
+        <w:pStyle w:val="ListBullet"/>
+        <w:spacing w:after="80"/>
+      </w:pPr>
+      <w:r>
+        <w:t>05 O e-mail de encerramento deverá conter também o link da pesquisa de satisfação para avaliação do atendimento.</w:t>
+      </w:r>
+    </w:p>
+    <w:p>
+      <w:r>
+        <w:t xml:space="preserve">Após o encerramento do chamado com status </w:t>
+      </w:r>
+      <w:r>
+        <w:rPr>
+          <w:b/>
+        </w:rPr>
+        <w:t>SOLUCIONADO</w:t>
+      </w:r>
+      <w:r>
+        <w:t xml:space="preserve"> ou </w:t>
+      </w:r>
+      <w:r>
+        <w:rPr>
+          <w:b/>
+        </w:rPr>
+        <w:t>FECHADO</w:t>
+      </w:r>
+      <w:r>
+        <w:t>, o usuário receberá automaticamente um e-mail contendo:</w:t>
+      </w:r>
+    </w:p>
+    <w:p>
+      <w:pPr>
+        <w:pStyle w:val="ListBullet"/>
+        <w:spacing w:after="80"/>
+      </w:pPr>
+      <w:r>
+        <w:t>🎫 Número do ticket</w:t>
+      </w:r>
+    </w:p>
+    <w:p>
+      <w:pPr>
+        <w:pStyle w:val="ListBullet"/>
+        <w:spacing w:after="80"/>
+      </w:pPr>
+      <w:r>
+        <w:t>👤 Nome do usuário</w:t>
+      </w:r>
+    </w:p>
+    <w:p>
+      <w:pPr>
+        <w:pStyle w:val="ListBullet"/>
+        <w:spacing w:after="80"/>
+      </w:pPr>
+      <w:r>
+        <w:t>📅 Data de abertura</w:t>
+      </w:r>
+    </w:p>
+    <w:p>
+      <w:pPr>
+        <w:pStyle w:val="ListBullet"/>
+        <w:spacing w:after="80"/>
+      </w:pPr>
+      <w:r>
+        <w:t>⭐ Link para avaliação do atendimento</w:t>
+      </w:r>
+    </w:p>
+    <w:p>
+      <w:pPr>
+        <w:pStyle w:val="ListBullet"/>
+        <w:spacing w:after="80"/>
+      </w:pPr>
+      <w:r>
+        <w:t>✅ Confirmação da finalização do chamado</w:t>
+      </w:r>
+    </w:p>
+    <w:p>
+      <w:pPr>
+        <w:keepNext/>
+        <w:jc w:val="center"/>
+      </w:pPr>
+      <w:r/>
+    </w:p>
+    <w:p>
+      <w:pPr>
+        <w:spacing w:after="160"/>
+        <w:jc w:val="center"/>
+      </w:pPr>
+      <w:r>
+        <w:rPr>
+          <w:rFonts w:ascii="Arial" w:hAnsi="Arial"/>
+          <w:i/>
+          <w:color w:val="5E6B78"/>
+          <w:sz w:val="17"/>
+        </w:rPr>
+        <w:t>Modelo de e-mail de encerramento do chamado e pesquisa de satisfação</w:t>
+      </w:r>
+    </w:p>
+    <w:p>
+      <w:pPr>
+        <w:spacing w:after="80"/>
+      </w:pPr>
+      <w:r>
+        <w:rPr>
+          <w:color w:val="163A63"/>
+        </w:rPr>
+        <w:t>⚠️ Importante: Chamados com status SOLUCIONADO ou FECHADO disparam a notificação automática de encerramento.</w:t>
+      </w:r>
+    </w:p>
+    <w:p>
+      <w:pPr>
+        <w:pStyle w:val="Heading1"/>
+      </w:pPr>
+      <w:r>
+        <w:t>Processo 3 - Regras de Integração e Padronização</w:t>
+      </w:r>
+    </w:p>
+    <w:p>
+      <w:r>
+        <w:t>As notificações dependem da padronização dos campos do GLPI e do funcionamento integrado com os fluxos automatizados. Por isso, os campos utilizados nos processos de abertura e encerramento devem ser mantidos conforme definidos pela administração do GLPI.</w:t>
+      </w:r>
+    </w:p>
+    <w:p>
+      <w:pPr>
+        <w:spacing w:after="80"/>
+      </w:pPr>
+      <w:r>
+        <w:rPr>
+          <w:color w:val="163A63"/>
+        </w:rPr>
+        <w:t>🚫 Atenção: Os campos padronizados não deverão ser alterados, removidos ou modificados sem validação prévia da administração do GLPI, pois alterações indevidas poderão comprometer o funcionamento das regras automatizadas, notificação de e-mail para abertura e encerramento de chamado, categorização dos chamados e integrações implementadas no n8n.</w:t>
+      </w:r>
+    </w:p>
+    <w:p>
+      <w:pPr>
+        <w:spacing w:after="80"/>
+      </w:pPr>
+      <w:r>
+        <w:rPr>
+          <w:color w:val="163A63"/>
+        </w:rPr>
+        <w:t>📧 Campo de e-mail obrigatório: O campo de e-mail do usuário deverá obrigatoriamente ser preenchido durante a abertura do chamado, pois somente através desse campo será possível realizar o disparo das notificações automáticas de abertura, encerramento e pesquisa de satisfação.</w:t>
+      </w:r>
+    </w:p>
+    <w:p>
+      <w:r>
+        <w:t xml:space="preserve">Caso haja necessidade de inclusão, ajuste ou alteração nos scripts padronizados, a solicitação deverá ser encaminhada à </w:t>
+      </w:r>
+      <w:r>
+        <w:rPr>
+          <w:b/>
+        </w:rPr>
+        <w:t>equipe responsável pela administração e governança do GLPI</w:t>
+      </w:r>
+      <w:r>
+        <w:t>.</w:t>
+      </w:r>
+    </w:p>
+    <w:p>
+      <w:pPr>
+        <w:pStyle w:val="Heading1"/>
+      </w:pPr>
+      <w:r>
+        <w:t>Histórico de Revisão</w:t>
       </w:r>
     </w:p>
     <w:tbl>
@@ -230,527 +977,6 @@
       <w:pPr>
         <w:spacing w:after="40"/>
       </w:pPr>
-    </w:p>
-    <w:p>
-      <w:pPr>
-        <w:pStyle w:val="Heading1"/>
-      </w:pPr>
-      <w:r>
-        <w:t>02 Objetivo</w:t>
-      </w:r>
-    </w:p>
-    <w:p>
-      <w:r>
-        <w:t xml:space="preserve">Este Processo Operacional estabelece como os chamados devem ser abertos e encerrados no </w:t>
-      </w:r>
-      <w:r>
-        <w:rPr>
-          <w:b/>
-        </w:rPr>
-        <w:t>GLPI</w:t>
-      </w:r>
-      <w:r>
-        <w:t xml:space="preserve"> para que as notificações automáticas por e-mail sejam enviadas corretamente ao usuário final, garantindo padronização, rastreabilidade, transparência e melhoria contínua dos atendimentos.</w:t>
-      </w:r>
-    </w:p>
-    <w:p>
-      <w:pPr>
-        <w:pStyle w:val="Heading1"/>
-      </w:pPr>
-      <w:r>
-        <w:t>03 Visão Geral das Notificações Automáticas</w:t>
-      </w:r>
-    </w:p>
-    <w:p>
-      <w:r>
-        <w:t xml:space="preserve">Os usuários receberão automaticamente notificação de e-mail para abertura e encerramento de chamado durante o ciclo de vida do chamado, conforme os dados registrados no </w:t>
-      </w:r>
-      <w:r>
-        <w:rPr>
-          <w:b/>
-        </w:rPr>
-        <w:t>GLPI</w:t>
-      </w:r>
-      <w:r>
-        <w:t xml:space="preserve"> e os modelos padronizados implementados através da integração com o </w:t>
-      </w:r>
-      <w:r>
-        <w:rPr>
-          <w:b/>
-        </w:rPr>
-        <w:t>n8n</w:t>
-      </w:r>
-      <w:r>
-        <w:t>.</w:t>
-      </w:r>
-    </w:p>
-    <w:p>
-      <w:r>
-        <w:t xml:space="preserve">As notificações serão enviadas automaticamente a cada </w:t>
-      </w:r>
-      <w:r>
-        <w:rPr>
-          <w:b/>
-        </w:rPr>
-        <w:t>5 minutos</w:t>
-      </w:r>
-      <w:r>
-        <w:t xml:space="preserve"> e contemplarão dois processos principais:</w:t>
-      </w:r>
-    </w:p>
-    <w:p>
-      <w:pPr>
-        <w:pStyle w:val="ListBullet"/>
-        <w:spacing w:after="80"/>
-      </w:pPr>
-      <w:r>
-        <w:t>✅ Confirmação de abertura do chamado</w:t>
-      </w:r>
-    </w:p>
-    <w:p>
-      <w:pPr>
-        <w:pStyle w:val="ListBullet"/>
-        <w:spacing w:after="80"/>
-      </w:pPr>
-      <w:r>
-        <w:t>🔗 Informações para acompanhamento do ticket</w:t>
-      </w:r>
-    </w:p>
-    <w:p>
-      <w:pPr>
-        <w:pStyle w:val="ListBullet"/>
-        <w:spacing w:after="80"/>
-      </w:pPr>
-      <w:r>
-        <w:t>🔒 Notificação de encerramento do chamado</w:t>
-      </w:r>
-    </w:p>
-    <w:p>
-      <w:pPr>
-        <w:pStyle w:val="ListBullet"/>
-        <w:spacing w:after="80"/>
-      </w:pPr>
-      <w:r>
-        <w:t>⭐ Envio de pesquisa de satisfação ao usuário</w:t>
-      </w:r>
-    </w:p>
-    <w:p>
-      <w:pPr>
-        <w:pStyle w:val="Heading1"/>
-      </w:pPr>
-      <w:r>
-        <w:t>FLUXO Fluxo resumido das notificações</w:t>
-      </w:r>
-    </w:p>
-    <w:p>
-      <w:pPr>
-        <w:spacing w:after="80"/>
-      </w:pPr>
-      <w:r>
-        <w:t>1. Abrir O chamado é registrado no GLPI com o e-mail correto do usuário.</w:t>
-      </w:r>
-    </w:p>
-    <w:p>
-      <w:pPr>
-        <w:spacing w:after="80"/>
-      </w:pPr>
-      <w:r>
-        <w:t>2. Processar A automação consulta os eventos do GLPI e prepara a comunicação padronizada.</w:t>
-      </w:r>
-    </w:p>
-    <w:p>
-      <w:pPr>
-        <w:spacing w:after="80"/>
-      </w:pPr>
-      <w:r>
-        <w:t>3. Notificar O usuário recebe por e-mail o protocolo e as atualizações previstas no processo.</w:t>
-      </w:r>
-    </w:p>
-    <w:p>
-      <w:pPr>
-        <w:spacing w:after="80"/>
-      </w:pPr>
-      <w:r>
-        <w:t>4. Concluir Na solução ou no fechamento, é enviada a confirmação com o link da pesquisa de satisfação.</w:t>
-      </w:r>
-    </w:p>
-    <w:p>
-      <w:pPr>
-        <w:pStyle w:val="Heading1"/>
-      </w:pPr>
-      <w:r>
-        <w:t>04 Processo 1 Abertura do Chamado</w:t>
-      </w:r>
-    </w:p>
-    <w:p>
-      <w:r>
-        <w:t>A abertura do chamado deve ser realizada com preenchimento completo dos campos necessários para que o GLPI registre corretamente a solicitação e envie a confirmação de abertura ao usuário final.</w:t>
-      </w:r>
-    </w:p>
-    <w:p>
-      <w:pPr>
-        <w:pStyle w:val="ListBullet"/>
-        <w:spacing w:after="80"/>
-      </w:pPr>
-      <w:r>
-        <w:t>01 Acessar o GLPI e iniciar a criação do chamado.</w:t>
-      </w:r>
-    </w:p>
-    <w:p>
-      <w:pPr>
-        <w:pStyle w:val="ListBullet"/>
-        <w:spacing w:after="80"/>
-      </w:pPr>
-      <w:r>
-        <w:t>02 Preencher os dados do usuário final, incluindo nome, unidade, setor e demais informações de identificação.</w:t>
-      </w:r>
-    </w:p>
-    <w:p>
-      <w:pPr>
-        <w:pStyle w:val="ListBullet"/>
-        <w:spacing w:after="80"/>
-      </w:pPr>
-      <w:r>
-        <w:t>03 Preencher obrigatoriamente o campo de e-mail do usuário final, pois é esse campo que permite o envio da confirmação automática de abertura.</w:t>
-      </w:r>
-    </w:p>
-    <w:p>
-      <w:pPr>
-        <w:pStyle w:val="ListBullet"/>
-        <w:spacing w:after="80"/>
-      </w:pPr>
-      <w:r>
-        <w:t>04 Categorizar o chamado conforme o catálogo de serviços, selecionando categoria, tipo, urgência e grupo técnico responsável quando aplicável.</w:t>
-      </w:r>
-    </w:p>
-    <w:p>
-      <w:pPr>
-        <w:pStyle w:val="ListBullet"/>
-        <w:spacing w:after="80"/>
-      </w:pPr>
-      <w:r>
-        <w:t>05 Preencher título e descrição de forma clara, objetiva e suficiente para entendimento da demanda.</w:t>
-      </w:r>
-    </w:p>
-    <w:p>
-      <w:pPr>
-        <w:pStyle w:val="ListBullet"/>
-        <w:spacing w:after="80"/>
-      </w:pPr>
-      <w:r>
-        <w:t>06 Salvar o chamado no GLPI e conferir se os dados essenciais foram registrados corretamente.</w:t>
-      </w:r>
-    </w:p>
-    <w:p>
-      <w:pPr>
-        <w:spacing w:after="80"/>
-      </w:pPr>
-      <w:r>
-        <w:rPr>
-          <w:color w:val="163A63"/>
-        </w:rPr>
-        <w:t>📧 E-mail obrigatório: sem o e-mail do usuário final, a confirmação automática de abertura não será enviada corretamente.</w:t>
-      </w:r>
-    </w:p>
-    <w:p>
-      <w:r>
-        <w:t>Após o registro do chamado no GLPI, o usuário receberá automaticamente um e-mail contendo:</w:t>
-      </w:r>
-    </w:p>
-    <w:p>
-      <w:pPr>
-        <w:pStyle w:val="ListBullet"/>
-        <w:spacing w:after="80"/>
-      </w:pPr>
-      <w:r>
-        <w:t>🎫 Número do ticket</w:t>
-      </w:r>
-    </w:p>
-    <w:p>
-      <w:pPr>
-        <w:pStyle w:val="ListBullet"/>
-        <w:spacing w:after="80"/>
-      </w:pPr>
-      <w:r>
-        <w:t>👤 Nome do usuário</w:t>
-      </w:r>
-    </w:p>
-    <w:p>
-      <w:pPr>
-        <w:pStyle w:val="ListBullet"/>
-        <w:spacing w:after="80"/>
-      </w:pPr>
-      <w:r>
-        <w:t>📅 Data de abertura</w:t>
-      </w:r>
-    </w:p>
-    <w:p>
-      <w:pPr>
-        <w:pStyle w:val="ListBullet"/>
-        <w:spacing w:after="80"/>
-      </w:pPr>
-      <w:r>
-        <w:t>🔍 Informações para acompanhamento do chamado</w:t>
-      </w:r>
-    </w:p>
-    <w:p>
-      <w:pPr>
-        <w:keepNext/>
-        <w:jc w:val="center"/>
-      </w:pPr>
-      <w:r/>
-    </w:p>
-    <w:p>
-      <w:pPr>
-        <w:spacing w:after="160"/>
-        <w:jc w:val="center"/>
-      </w:pPr>
-      <w:r>
-        <w:rPr>
-          <w:rFonts w:ascii="Arial" w:hAnsi="Arial"/>
-          <w:i/>
-          <w:color w:val="5E6B78"/>
-          <w:sz w:val="17"/>
-        </w:rPr>
-        <w:t>Modelo de e-mail de confirmação de abertura de chamado</w:t>
-      </w:r>
-    </w:p>
-    <w:p>
-      <w:pPr>
-        <w:spacing w:after="80"/>
-      </w:pPr>
-      <w:r>
-        <w:rPr>
-          <w:color w:val="163A63"/>
-        </w:rPr>
-        <w:t>⚠️ Atenção: Para que os usuários recebam corretamente as notificações automáticas, o campo de e-mail e nome deverão ser obrigatoriamente preenchidos na abertura do chamado.</w:t>
-      </w:r>
-    </w:p>
-    <w:p>
-      <w:pPr>
-        <w:pStyle w:val="Heading1"/>
-      </w:pPr>
-      <w:r>
-        <w:t>05 Processo 2 Encerramento do Chamado</w:t>
-      </w:r>
-    </w:p>
-    <w:p>
-      <w:r>
-        <w:t xml:space="preserve">O encerramento do chamado deve ser realizado somente após o atendimento ser concluído e a solução estar registrada no GLPI. Ao alterar o status para </w:t>
-      </w:r>
-      <w:r>
-        <w:rPr>
-          <w:b/>
-        </w:rPr>
-        <w:t>SOLUCIONADO</w:t>
-      </w:r>
-      <w:r>
-        <w:t xml:space="preserve"> ou </w:t>
-      </w:r>
-      <w:r>
-        <w:rPr>
-          <w:b/>
-        </w:rPr>
-        <w:t>FECHADO</w:t>
-      </w:r>
-      <w:r>
-        <w:t>, o usuário final receberá a notificação automática de encerramento e o link da pesquisa de satisfação.</w:t>
-      </w:r>
-    </w:p>
-    <w:p>
-      <w:pPr>
-        <w:pStyle w:val="ListBullet"/>
-        <w:spacing w:after="80"/>
-      </w:pPr>
-      <w:r>
-        <w:t>01 Confirmar que o atendimento foi concluído e que não há pendência técnica ou administrativa no chamado.</w:t>
-      </w:r>
-    </w:p>
-    <w:p>
-      <w:pPr>
-        <w:pStyle w:val="ListBullet"/>
-        <w:spacing w:after="80"/>
-      </w:pPr>
-      <w:r>
-        <w:t>02 Registrar a solução no chamado, descrevendo de forma objetiva o que foi realizado e o resultado do atendimento.</w:t>
-      </w:r>
-    </w:p>
-    <w:p>
-      <w:pPr>
-        <w:pStyle w:val="ListBullet"/>
-        <w:spacing w:after="80"/>
-      </w:pPr>
-      <w:r>
-        <w:t>03 Alterar o status do chamado para SOLUCIONADO ou FECHADO .</w:t>
-      </w:r>
-    </w:p>
-    <w:p>
-      <w:pPr>
-        <w:pStyle w:val="ListBullet"/>
-        <w:spacing w:after="80"/>
-      </w:pPr>
-      <w:r>
-        <w:t>04 Após a alteração do status, o GLPI/n8n enviará automaticamente ao usuário final o e-mail de encerramento.</w:t>
-      </w:r>
-    </w:p>
-    <w:p>
-      <w:pPr>
-        <w:pStyle w:val="ListBullet"/>
-        <w:spacing w:after="80"/>
-      </w:pPr>
-      <w:r>
-        <w:t>05 O e-mail de encerramento deverá conter também o link da pesquisa de satisfação para avaliação do atendimento.</w:t>
-      </w:r>
-    </w:p>
-    <w:p>
-      <w:r>
-        <w:t xml:space="preserve">Após o encerramento do chamado com status </w:t>
-      </w:r>
-      <w:r>
-        <w:rPr>
-          <w:b/>
-        </w:rPr>
-        <w:t>SOLUCIONADO</w:t>
-      </w:r>
-      <w:r>
-        <w:t xml:space="preserve"> ou </w:t>
-      </w:r>
-      <w:r>
-        <w:rPr>
-          <w:b/>
-        </w:rPr>
-        <w:t>FECHADO</w:t>
-      </w:r>
-      <w:r>
-        <w:t>, o usuário receberá automaticamente um e-mail contendo:</w:t>
-      </w:r>
-    </w:p>
-    <w:p>
-      <w:pPr>
-        <w:pStyle w:val="ListBullet"/>
-        <w:spacing w:after="80"/>
-      </w:pPr>
-      <w:r>
-        <w:t>🎫 Número do ticket</w:t>
-      </w:r>
-    </w:p>
-    <w:p>
-      <w:pPr>
-        <w:pStyle w:val="ListBullet"/>
-        <w:spacing w:after="80"/>
-      </w:pPr>
-      <w:r>
-        <w:t>👤 Nome do usuário</w:t>
-      </w:r>
-    </w:p>
-    <w:p>
-      <w:pPr>
-        <w:pStyle w:val="ListBullet"/>
-        <w:spacing w:after="80"/>
-      </w:pPr>
-      <w:r>
-        <w:t>📅 Data de abertura</w:t>
-      </w:r>
-    </w:p>
-    <w:p>
-      <w:pPr>
-        <w:pStyle w:val="ListBullet"/>
-        <w:spacing w:after="80"/>
-      </w:pPr>
-      <w:r>
-        <w:t>⭐ Link para avaliação do atendimento</w:t>
-      </w:r>
-    </w:p>
-    <w:p>
-      <w:pPr>
-        <w:pStyle w:val="ListBullet"/>
-        <w:spacing w:after="80"/>
-      </w:pPr>
-      <w:r>
-        <w:t>✅ Confirmação da finalização do chamado</w:t>
-      </w:r>
-    </w:p>
-    <w:p>
-      <w:pPr>
-        <w:keepNext/>
-        <w:jc w:val="center"/>
-      </w:pPr>
-      <w:r/>
-    </w:p>
-    <w:p>
-      <w:pPr>
-        <w:spacing w:after="160"/>
-        <w:jc w:val="center"/>
-      </w:pPr>
-      <w:r>
-        <w:rPr>
-          <w:rFonts w:ascii="Arial" w:hAnsi="Arial"/>
-          <w:i/>
-          <w:color w:val="5E6B78"/>
-          <w:sz w:val="17"/>
-        </w:rPr>
-        <w:t>Modelo de e-mail de encerramento do chamado e pesquisa de satisfação</w:t>
-      </w:r>
-    </w:p>
-    <w:p>
-      <w:pPr>
-        <w:spacing w:after="80"/>
-      </w:pPr>
-      <w:r>
-        <w:rPr>
-          <w:color w:val="163A63"/>
-        </w:rPr>
-        <w:t>⚠️ Importante: Chamados com status SOLUCIONADO ou FECHADO disparam a notificação automática de encerramento.</w:t>
-      </w:r>
-    </w:p>
-    <w:p>
-      <w:pPr>
-        <w:pStyle w:val="Heading1"/>
-      </w:pPr>
-      <w:r>
-        <w:t>06 Regras de Integração e Padronização</w:t>
-      </w:r>
-    </w:p>
-    <w:p>
-      <w:r>
-        <w:t>As notificações dependem da padronização dos campos do GLPI e do funcionamento integrado com os fluxos automatizados. Por isso, os campos utilizados nos processos de abertura e encerramento devem ser mantidos conforme definidos pela administração do GLPI.</w:t>
-      </w:r>
-    </w:p>
-    <w:p>
-      <w:pPr>
-        <w:spacing w:after="80"/>
-      </w:pPr>
-      <w:r>
-        <w:rPr>
-          <w:color w:val="163A63"/>
-        </w:rPr>
-        <w:t>🚫 Atenção: Os campos padronizados não deverão ser alterados, removidos ou modificados sem validação prévia da administração do GLPI, pois alterações indevidas poderão comprometer o funcionamento das regras automatizadas, notificação de e-mail para abertura e encerramento de chamado, categorização dos chamados e integrações implementadas no n8n.</w:t>
-      </w:r>
-    </w:p>
-    <w:p>
-      <w:pPr>
-        <w:spacing w:after="80"/>
-      </w:pPr>
-      <w:r>
-        <w:rPr>
-          <w:color w:val="163A63"/>
-        </w:rPr>
-        <w:t>📧 Campo de e-mail obrigatório: O campo de e-mail do usuário deverá obrigatoriamente ser preenchido durante a abertura do chamado, pois somente através desse campo será possível realizar o disparo das notificações automáticas de abertura, encerramento e pesquisa de satisfação.</w:t>
-      </w:r>
-    </w:p>
-    <w:p>
-      <w:r>
-        <w:t xml:space="preserve">Caso haja necessidade de inclusão, ajuste ou alteração nos scripts padronizados, a solicitação deverá ser encaminhada à </w:t>
-      </w:r>
-      <w:r>
-        <w:rPr>
-          <w:b/>
-        </w:rPr>
-        <w:t>equipe responsável pela administração e governança do GLPI</w:t>
-      </w:r>
-      <w:r>
-        <w:t>.</w:t>
-      </w:r>
     </w:p>
     <w:sectPr>
       <w:headerReference w:type="default" r:id="rId9"/>

</xml_diff>